<commit_message>
docs: regenerate capability doc for v0.52.2 (signature App-ID, AV, IPS+CVE, URL lists, WildFire)
Updated docs/build_pan_fortigate_doc.js + rebuilt .docx/.pdf/.html: App-ID is
now per-application signatures (parity with FortiConverter, sourced live from
the target's FortiGuard DB); added antivirus, WildFire->FortiSandbox, IPS
(severity + CVE crosswalk), and custom-URL-list->urlfilter; limitations and
comparison rewritten accordingly; example shows the IPS CVE crosswalk. Only
Data Filtering -> DLP remains unconverted.

Co-Authored-By: Claude Opus 4.8 (1M context) <noreply@anthropic.com>
</commit_message>
<xml_diff>
--- a/fwforge_PaloAlto_to_FortiGate.docx
+++ b/fwforge_PaloAlto_to_FortiGate.docx
@@ -71,7 +71,7 @@
         <w:rPr>
           <w:color w:val="555555"/>
         </w:rPr>
-        <w:t xml:space="preserve">Prepared for Fortinet engineering review · June 2026 · fwforge v0.49.0</w:t>
+        <w:t xml:space="preserve">Prepared for Fortinet engineering review · June 2026 · fwforge v0.52.2</w:t>
       </w:r>
     </w:p>
     <w:p>
@@ -192,10 +192,30 @@
           <w:b/>
           <w:bCs/>
         </w:rPr>
+        <w:t xml:space="preserve">Full security-profile coverage. </w:t>
+      </w:r>
+      <w:r>
+        <w:t xml:space="preserve">App-ID (per-application signatures), URL filtering (FortiGuard categories + explicit URL lists), file blocking, antivirus, WildFire (→ FortiSandbox), and IPS (anti-spyware / vulnerability) all convert — every PAN security-profile type except Data Filtering — each schema-certified against the live target.</w:t>
+      </w:r>
+    </w:p>
+    <w:p>
+      <w:pPr>
+        <w:pStyle w:val="ListParagraph"/>
+        <w:numPr>
+          <w:ilvl w:val="0"/>
+          <w:numId w:val="2"/>
+        </w:numPr>
+        <w:spacing w:after="60"/>
+      </w:pPr>
+      <w:r>
+        <w:rPr>
+          <w:b/>
+          <w:bCs/>
+        </w:rPr>
         <w:t xml:space="preserve">Parity on the core, ahead on assurance. </w:t>
       </w:r>
       <w:r>
-        <w:t xml:space="preserve">It matches FortiConverter on the object / policy / NAT / routing / VPN conversion, and goes beyond it on output quality: every emitted config is schema-certified against the exact target firmware build, is deterministic and git-diffable, and carries per-line provenance back to the source line.</w:t>
+        <w:t xml:space="preserve">It matches FortiConverter on objects / policy / NAT / routing / VPN, and now on App-ID granularity, and goes beyond it on output quality: every emitted config is schema-certified against the exact target firmware build, is deterministic and git-diffable, and carries per-line provenance back to the source line.</w:t>
       </w:r>
     </w:p>
     <w:p>
@@ -203,7 +223,7 @@
         <w:spacing w:after="120"/>
       </w:pPr>
       <w:r>
-        <w:t xml:space="preserve">The conversions and category data in this document were </w:t>
+        <w:t xml:space="preserve">The conversions and signature data in this document were </w:t>
       </w:r>
       <w:r>
         <w:rPr>
@@ -213,7 +233,7 @@
         <w:t xml:space="preserve">verified live against a FortiGate-601F running FortiOS 8.0.0 build0167</w:t>
       </w:r>
       <w:r>
-        <w:t xml:space="preserve"> — FortiGuard web categories and file types were read from the device, and the emitted output was schema-certified clean (0 unknown tables, 0 unknown attributes).</w:t>
+        <w:t xml:space="preserve"> — the FortiGuard application-signature database, web categories, file types, and IPS filters were read from the device, and the emitted App-ID / web-filter / file-filter / antivirus / IPS / FortiSandbox output was schema-certified clean (0 unknown tables, 0 unknown attributes).</w:t>
       </w:r>
     </w:p>
     <w:p>
@@ -229,7 +249,27 @@
         <w:spacing w:after="120"/>
       </w:pPr>
       <w:r>
-        <w:t xml:space="preserve">Six properties distinguish fwforge from a typical converter. They are the reasons the output can be trusted on a production cutover.</w:t>
+        <w:t xml:space="preserve">These properties distinguish fwforge from a typical converter. They are the reasons the output can be trusted on a production cutover.</w:t>
+      </w:r>
+    </w:p>
+    <w:p>
+      <w:pPr>
+        <w:pStyle w:val="ListParagraph"/>
+        <w:numPr>
+          <w:ilvl w:val="0"/>
+          <w:numId w:val="2"/>
+        </w:numPr>
+        <w:spacing w:after="60"/>
+      </w:pPr>
+      <w:r>
+        <w:rPr>
+          <w:b/>
+          <w:bCs/>
+        </w:rPr>
+        <w:t xml:space="preserve">Mappings sourced from your own FortiGate. </w:t>
+      </w:r>
+      <w:r>
+        <w:t xml:space="preserve">Per-application App-ID, FortiGuard web categories, file types and IPS filters come from the target device's own FortiGuard database — read live (one read-only API call), cached locally, refreshable on demand — not a bundled third-party table that drifts. A staleness warning fires when the cache ages.</w:t>
       </w:r>
     </w:p>
     <w:p>
@@ -1392,7 +1432,7 @@
                 <w:sz w:val="18"/>
                 <w:szCs w:val="18"/>
               </w:rPr>
-              <w:t xml:space="preserve">App-IDs → application-control category profiles; App-IDs → policy service (standard ports); application-groups flattened to leaves</w:t>
+              <w:t xml:space="preserve">App-IDs → application-control with PER-APPLICATION signatures (matched to the FortiGuard app DB), category fallback for the rest; App-IDs → policy service (standard ports); application-groups flattened to leaves</w:t>
             </w:r>
           </w:p>
         </w:tc>
@@ -1425,7 +1465,7 @@
                 <w:sz w:val="18"/>
                 <w:szCs w:val="18"/>
               </w:rPr>
-              <w:t xml:space="preserve">Category-level (see §6). App-IDs that match a FortiOS built-in service are emitted as that named service.</w:t>
+              <w:t xml:space="preserve">Signature-level when an app DB is present (verified live, ~3,300 sigs). App-IDs matching a FortiOS built-in service emit that named service.</w:t>
             </w:r>
           </w:p>
         </w:tc>
@@ -1496,7 +1536,7 @@
                 <w:sz w:val="18"/>
                 <w:szCs w:val="18"/>
               </w:rPr>
-              <w:t xml:space="preserve">PAN url-filtering profiles → FortiOS webfilter (FortiGuard category) profiles</w:t>
+              <w:t xml:space="preserve">PAN url-filtering → FortiOS webfilter: FortiGuard categories + custom URL lists (custom-url-category) → a webfilter urlfilter table for per-URL allow/block</w:t>
             </w:r>
           </w:p>
         </w:tc>
@@ -1529,7 +1569,7 @@
                 <w:sz w:val="18"/>
                 <w:szCs w:val="18"/>
               </w:rPr>
-              <w:t xml:space="preserve">Category IDs verified live. PAN action → ftgd-wf action (block; alert→monitor; continue→warning; override→authenticate).</w:t>
+              <w:t xml:space="preserve">Category IDs verified live. PAN action → ftgd-wf action; URL with * → wildcard, else simple.</w:t>
             </w:r>
           </w:p>
         </w:tc>
@@ -1671,7 +1711,7 @@
                 <w:sz w:val="18"/>
                 <w:szCs w:val="18"/>
               </w:rPr>
-              <w:t xml:space="preserve">SSL inspection</w:t>
+              <w:t xml:space="preserve">Antivirus</w:t>
             </w:r>
           </w:p>
         </w:tc>
@@ -1704,7 +1744,7 @@
                 <w:sz w:val="18"/>
                 <w:szCs w:val="18"/>
               </w:rPr>
-              <w:t xml:space="preserve">webfilter / file-filter policies attached with the built-in certificate-inspection profile</w:t>
+              <w:t xml:space="preserve">PAN antivirus/virus → FortiOS antivirus profile (per-protocol av-scan block / monitor / disable from the PAN decoders)</w:t>
             </w:r>
           </w:p>
         </w:tc>
@@ -1737,7 +1777,7 @@
                 <w:sz w:val="18"/>
                 <w:szCs w:val="18"/>
               </w:rPr>
-              <w:t xml:space="preserve">SNI-based; no CA rollout. Switch to deep-inspection for full HTTPS content control.</w:t>
+              <w:t xml:space="preserve">FortiGuard AV engine + signatures do the scanning; per-protocol scan intent carried.</w:t>
             </w:r>
           </w:p>
         </w:tc>
@@ -1775,7 +1815,7 @@
                 <w:sz w:val="18"/>
                 <w:szCs w:val="18"/>
               </w:rPr>
-              <w:t xml:space="preserve">Security policies</w:t>
+              <w:t xml:space="preserve">WildFire</w:t>
             </w:r>
           </w:p>
         </w:tc>
@@ -1808,7 +1848,7 @@
                 <w:sz w:val="18"/>
                 <w:szCs w:val="18"/>
               </w:rPr>
-              <w:t xml:space="preserve">PAN rules → FortiOS firewall policy: zones, addresses, services, action, logging, disable state, source/destination negation</w:t>
+              <w:t xml:space="preserve">PAN wildfire-analysis → FortiSandbox submission folded into the antivirus profile (analytics-db + per-protocol fortisandbox)</w:t>
             </w:r>
           </w:p>
         </w:tc>
@@ -1841,7 +1881,7 @@
                 <w:sz w:val="18"/>
                 <w:szCs w:val="18"/>
               </w:rPr>
-              <w:t xml:space="preserve">Per-rule selection (exclude rules); schedules flagged; application-default handled.</w:t>
+              <w:t xml:space="preserve">Needs a device-level FortiSandbox appliance / Cloud (config system fortisandbox); flagged.</w:t>
             </w:r>
           </w:p>
         </w:tc>
@@ -1879,7 +1919,7 @@
                 <w:sz w:val="18"/>
                 <w:szCs w:val="18"/>
               </w:rPr>
-              <w:t xml:space="preserve">NAT</w:t>
+              <w:t xml:space="preserve">IPS</w:t>
             </w:r>
           </w:p>
         </w:tc>
@@ -1912,7 +1952,7 @@
                 <w:sz w:val="18"/>
                 <w:szCs w:val="18"/>
               </w:rPr>
-              <w:t xml:space="preserve">Source NAT (interface PAT) → policy NAT or central-snat-map; destination/static NAT → VIP (+ port-forward); subnet 1:1 DNAT → range VIP</w:t>
+              <w:t xml:space="preserve">PAN anti-spyware + vulnerability → one FortiOS IPS sensor: severity-filter entries + exact CVE-filter entries, FortiGuard-recommended baseline (action default)</w:t>
             </w:r>
           </w:p>
         </w:tc>
@@ -1945,7 +1985,7 @@
                 <w:sz w:val="18"/>
                 <w:szCs w:val="18"/>
               </w:rPr>
-              <w:t xml:space="preserve">NAT mode selectable: policy or central.</w:t>
+              <w:t xml:space="preserve">Posture parity, not signature-for-signature — CVE is the exact cross-vendor key; per-threat exceptions flagged (see §6).</w:t>
             </w:r>
           </w:p>
         </w:tc>
@@ -1983,7 +2023,7 @@
                 <w:sz w:val="18"/>
                 <w:szCs w:val="18"/>
               </w:rPr>
-              <w:t xml:space="preserve">Routing</w:t>
+              <w:t xml:space="preserve">SSL inspection</w:t>
             </w:r>
           </w:p>
         </w:tc>
@@ -2016,7 +2056,7 @@
                 <w:sz w:val="18"/>
                 <w:szCs w:val="18"/>
               </w:rPr>
-              <w:t xml:space="preserve">Static routes (egress inferred when omitted); BGP (AS, router-id, neighbors, networks, redistribute); OSPF (areas, networks, passive); IPv6 routes</w:t>
+              <w:t xml:space="preserve">webfilter / file-filter / AV / IPS policies attached with the built-in certificate-inspection profile</w:t>
             </w:r>
           </w:p>
         </w:tc>
@@ -2049,7 +2089,7 @@
                 <w:sz w:val="18"/>
                 <w:szCs w:val="18"/>
               </w:rPr>
-              <w:t xml:space="preserve">The route table also drives policy dstintf inference (longest-prefix-match).</w:t>
+              <w:t xml:space="preserve">SNI-based; no CA rollout. Switch to deep-inspection for full HTTPS content control.</w:t>
             </w:r>
           </w:p>
         </w:tc>
@@ -2087,7 +2127,7 @@
                 <w:sz w:val="18"/>
                 <w:szCs w:val="18"/>
               </w:rPr>
-              <w:t xml:space="preserve">IPsec VPN</w:t>
+              <w:t xml:space="preserve">Security policies</w:t>
             </w:r>
           </w:p>
         </w:tc>
@@ -2120,7 +2160,7 @@
                 <w:sz w:val="18"/>
                 <w:szCs w:val="18"/>
               </w:rPr>
-              <w:t xml:space="preserve">Site-to-site → route-based phase1/phase2-interface + tunnel routes + bidirectional policies; IKE crypto, proposals, PFS, IKEv2</w:t>
+              <w:t xml:space="preserve">PAN rules → FortiOS firewall policy: zones, addresses, services, action, logging, disable state, source/destination negation</w:t>
             </w:r>
           </w:p>
         </w:tc>
@@ -2153,7 +2193,7 @@
                 <w:sz w:val="18"/>
                 <w:szCs w:val="18"/>
               </w:rPr>
-              <w:t xml:space="preserve">Encrypted / exported PSKs detected → placeholder + error (never a silently broken secret).</w:t>
+              <w:t xml:space="preserve">Per-rule selection (exclude rules); schedules flagged; application-default handled.</w:t>
             </w:r>
           </w:p>
         </w:tc>
@@ -2191,7 +2231,7 @@
                 <w:sz w:val="18"/>
                 <w:szCs w:val="18"/>
               </w:rPr>
-              <w:t xml:space="preserve">Output hygiene</w:t>
+              <w:t xml:space="preserve">NAT</w:t>
             </w:r>
           </w:p>
         </w:tc>
@@ -2224,7 +2264,7 @@
                 <w:sz w:val="18"/>
                 <w:szCs w:val="18"/>
               </w:rPr>
-              <w:t xml:space="preserve">Prune unreferenced objects (iterative); merge duplicate objects; split interface pairs; include/exclude rules</w:t>
+              <w:t xml:space="preserve">Source NAT (interface PAT) → policy NAT or central-snat-map; destination/static NAT → VIP (+ port-forward); subnet 1:1 DNAT → range VIP</w:t>
             </w:r>
           </w:p>
         </w:tc>
@@ -2257,7 +2297,7 @@
                 <w:sz w:val="18"/>
                 <w:szCs w:val="18"/>
               </w:rPr>
-              <w:t xml:space="preserve">Acts on the output, not just reports.</w:t>
+              <w:t xml:space="preserve">NAT mode selectable: policy or central.</w:t>
             </w:r>
           </w:p>
         </w:tc>
@@ -2295,7 +2335,7 @@
                 <w:sz w:val="18"/>
                 <w:szCs w:val="18"/>
               </w:rPr>
-              <w:t xml:space="preserve">Output packaging</w:t>
+              <w:t xml:space="preserve">Routing</w:t>
             </w:r>
           </w:p>
         </w:tc>
@@ -2328,7 +2368,7 @@
                 <w:sz w:val="18"/>
                 <w:szCs w:val="18"/>
               </w:rPr>
-              <w:t xml:space="preserve">config-all.txt + per-branch script files; findings embedded as # comments</w:t>
+              <w:t xml:space="preserve">Static routes (egress inferred when omitted); BGP (AS, router-id, neighbors, networks, redistribute); OSPF (areas, networks, passive); IPv6 routes</w:t>
             </w:r>
           </w:p>
         </w:tc>
@@ -2361,7 +2401,7 @@
                 <w:sz w:val="18"/>
                 <w:szCs w:val="18"/>
               </w:rPr>
-              <w:t xml:space="preserve">Deterministic ordering; restore-safe.</w:t>
+              <w:t xml:space="preserve">The route table also drives policy dstintf inference (longest-prefix-match).</w:t>
             </w:r>
           </w:p>
         </w:tc>
@@ -2399,7 +2439,7 @@
                 <w:sz w:val="18"/>
                 <w:szCs w:val="18"/>
               </w:rPr>
-              <w:t xml:space="preserve">FortiManager</w:t>
+              <w:t xml:space="preserve">IPsec VPN</w:t>
             </w:r>
           </w:p>
         </w:tc>
@@ -2432,7 +2472,7 @@
                 <w:sz w:val="18"/>
                 <w:szCs w:val="18"/>
               </w:rPr>
-              <w:t xml:space="preserve">Optional JSON-RPC import bundle: object creates + a policy package for an ADOM</w:t>
+              <w:t xml:space="preserve">Site-to-site → route-based phase1/phase2-interface + tunnel routes + bidirectional policies; IKE crypto, proposals, PFS, IKEv2</w:t>
             </w:r>
           </w:p>
         </w:tc>
@@ -2465,7 +2505,7 @@
                 <w:sz w:val="18"/>
                 <w:szCs w:val="18"/>
               </w:rPr>
-              <w:t xml:space="preserve"/>
+              <w:t xml:space="preserve">Encrypted / exported PSKs detected → placeholder + error (never a silently broken secret).</w:t>
             </w:r>
           </w:p>
         </w:tc>
@@ -2503,6 +2543,318 @@
                 <w:sz w:val="18"/>
                 <w:szCs w:val="18"/>
               </w:rPr>
+              <w:t xml:space="preserve">Output hygiene</w:t>
+            </w:r>
+          </w:p>
+        </w:tc>
+        <w:tc>
+          <w:tcPr>
+            <w:tcW w:type="dxa" w:w="4060"/>
+            <w:tcBorders>
+              <w:top w:val="single" w:color="B7B7B7" w:sz="1"/>
+              <w:left w:val="single" w:color="B7B7B7" w:sz="1"/>
+              <w:bottom w:val="single" w:color="B7B7B7" w:sz="1"/>
+              <w:right w:val="single" w:color="B7B7B7" w:sz="1"/>
+            </w:tcBorders>
+            <w:shd w:fill="FFFFFF" w:val="clear"/>
+            <w:tcMar>
+              <w:top w:type="dxa" w:w="60"/>
+              <w:left w:type="dxa" w:w="110"/>
+              <w:bottom w:type="dxa" w:w="60"/>
+              <w:right w:type="dxa" w:w="110"/>
+            </w:tcMar>
+          </w:tcPr>
+          <w:p>
+            <w:pPr>
+              <w:spacing w:after="0"/>
+            </w:pPr>
+            <w:r>
+              <w:rPr>
+                <w:b w:val="false"/>
+                <w:bCs w:val="false"/>
+                <w:color w:val="1A1A1A"/>
+                <w:sz w:val="18"/>
+                <w:szCs w:val="18"/>
+              </w:rPr>
+              <w:t xml:space="preserve">Prune unreferenced objects (iterative); merge duplicate objects; split interface pairs; include/exclude rules</w:t>
+            </w:r>
+          </w:p>
+        </w:tc>
+        <w:tc>
+          <w:tcPr>
+            <w:tcW w:type="dxa" w:w="3600"/>
+            <w:tcBorders>
+              <w:top w:val="single" w:color="B7B7B7" w:sz="1"/>
+              <w:left w:val="single" w:color="B7B7B7" w:sz="1"/>
+              <w:bottom w:val="single" w:color="B7B7B7" w:sz="1"/>
+              <w:right w:val="single" w:color="B7B7B7" w:sz="1"/>
+            </w:tcBorders>
+            <w:shd w:fill="FFFFFF" w:val="clear"/>
+            <w:tcMar>
+              <w:top w:type="dxa" w:w="60"/>
+              <w:left w:type="dxa" w:w="110"/>
+              <w:bottom w:type="dxa" w:w="60"/>
+              <w:right w:type="dxa" w:w="110"/>
+            </w:tcMar>
+          </w:tcPr>
+          <w:p>
+            <w:pPr>
+              <w:spacing w:after="0"/>
+            </w:pPr>
+            <w:r>
+              <w:rPr>
+                <w:b w:val="false"/>
+                <w:bCs w:val="false"/>
+                <w:color w:val="1A1A1A"/>
+                <w:sz w:val="18"/>
+                <w:szCs w:val="18"/>
+              </w:rPr>
+              <w:t xml:space="preserve">Acts on the output, not just reports.</w:t>
+            </w:r>
+          </w:p>
+        </w:tc>
+      </w:tr>
+      <w:tr>
+        <w:trPr>
+          <w:tblHeader w:val="false"/>
+        </w:trPr>
+        <w:tc>
+          <w:tcPr>
+            <w:tcW w:type="dxa" w:w="1700"/>
+            <w:tcBorders>
+              <w:top w:val="single" w:color="B7B7B7" w:sz="1"/>
+              <w:left w:val="single" w:color="B7B7B7" w:sz="1"/>
+              <w:bottom w:val="single" w:color="B7B7B7" w:sz="1"/>
+              <w:right w:val="single" w:color="B7B7B7" w:sz="1"/>
+            </w:tcBorders>
+            <w:shd w:fill="FFFFFF" w:val="clear"/>
+            <w:tcMar>
+              <w:top w:type="dxa" w:w="60"/>
+              <w:left w:type="dxa" w:w="110"/>
+              <w:bottom w:type="dxa" w:w="60"/>
+              <w:right w:type="dxa" w:w="110"/>
+            </w:tcMar>
+          </w:tcPr>
+          <w:p>
+            <w:pPr>
+              <w:spacing w:after="0"/>
+            </w:pPr>
+            <w:r>
+              <w:rPr>
+                <w:b/>
+                <w:bCs/>
+                <w:color w:val="1A1A1A"/>
+                <w:sz w:val="18"/>
+                <w:szCs w:val="18"/>
+              </w:rPr>
+              <w:t xml:space="preserve">Output packaging</w:t>
+            </w:r>
+          </w:p>
+        </w:tc>
+        <w:tc>
+          <w:tcPr>
+            <w:tcW w:type="dxa" w:w="4060"/>
+            <w:tcBorders>
+              <w:top w:val="single" w:color="B7B7B7" w:sz="1"/>
+              <w:left w:val="single" w:color="B7B7B7" w:sz="1"/>
+              <w:bottom w:val="single" w:color="B7B7B7" w:sz="1"/>
+              <w:right w:val="single" w:color="B7B7B7" w:sz="1"/>
+            </w:tcBorders>
+            <w:shd w:fill="FFFFFF" w:val="clear"/>
+            <w:tcMar>
+              <w:top w:type="dxa" w:w="60"/>
+              <w:left w:type="dxa" w:w="110"/>
+              <w:bottom w:type="dxa" w:w="60"/>
+              <w:right w:type="dxa" w:w="110"/>
+            </w:tcMar>
+          </w:tcPr>
+          <w:p>
+            <w:pPr>
+              <w:spacing w:after="0"/>
+            </w:pPr>
+            <w:r>
+              <w:rPr>
+                <w:b w:val="false"/>
+                <w:bCs w:val="false"/>
+                <w:color w:val="1A1A1A"/>
+                <w:sz w:val="18"/>
+                <w:szCs w:val="18"/>
+              </w:rPr>
+              <w:t xml:space="preserve">config-all.txt + per-branch script files; findings embedded as # comments</w:t>
+            </w:r>
+          </w:p>
+        </w:tc>
+        <w:tc>
+          <w:tcPr>
+            <w:tcW w:type="dxa" w:w="3600"/>
+            <w:tcBorders>
+              <w:top w:val="single" w:color="B7B7B7" w:sz="1"/>
+              <w:left w:val="single" w:color="B7B7B7" w:sz="1"/>
+              <w:bottom w:val="single" w:color="B7B7B7" w:sz="1"/>
+              <w:right w:val="single" w:color="B7B7B7" w:sz="1"/>
+            </w:tcBorders>
+            <w:shd w:fill="FFFFFF" w:val="clear"/>
+            <w:tcMar>
+              <w:top w:type="dxa" w:w="60"/>
+              <w:left w:type="dxa" w:w="110"/>
+              <w:bottom w:type="dxa" w:w="60"/>
+              <w:right w:type="dxa" w:w="110"/>
+            </w:tcMar>
+          </w:tcPr>
+          <w:p>
+            <w:pPr>
+              <w:spacing w:after="0"/>
+            </w:pPr>
+            <w:r>
+              <w:rPr>
+                <w:b w:val="false"/>
+                <w:bCs w:val="false"/>
+                <w:color w:val="1A1A1A"/>
+                <w:sz w:val="18"/>
+                <w:szCs w:val="18"/>
+              </w:rPr>
+              <w:t xml:space="preserve">Deterministic ordering; restore-safe.</w:t>
+            </w:r>
+          </w:p>
+        </w:tc>
+      </w:tr>
+      <w:tr>
+        <w:trPr>
+          <w:tblHeader w:val="false"/>
+        </w:trPr>
+        <w:tc>
+          <w:tcPr>
+            <w:tcW w:type="dxa" w:w="1700"/>
+            <w:tcBorders>
+              <w:top w:val="single" w:color="B7B7B7" w:sz="1"/>
+              <w:left w:val="single" w:color="B7B7B7" w:sz="1"/>
+              <w:bottom w:val="single" w:color="B7B7B7" w:sz="1"/>
+              <w:right w:val="single" w:color="B7B7B7" w:sz="1"/>
+            </w:tcBorders>
+            <w:shd w:fill="FFFFFF" w:val="clear"/>
+            <w:tcMar>
+              <w:top w:type="dxa" w:w="60"/>
+              <w:left w:type="dxa" w:w="110"/>
+              <w:bottom w:type="dxa" w:w="60"/>
+              <w:right w:type="dxa" w:w="110"/>
+            </w:tcMar>
+          </w:tcPr>
+          <w:p>
+            <w:pPr>
+              <w:spacing w:after="0"/>
+            </w:pPr>
+            <w:r>
+              <w:rPr>
+                <w:b/>
+                <w:bCs/>
+                <w:color w:val="1A1A1A"/>
+                <w:sz w:val="18"/>
+                <w:szCs w:val="18"/>
+              </w:rPr>
+              <w:t xml:space="preserve">FortiManager</w:t>
+            </w:r>
+          </w:p>
+        </w:tc>
+        <w:tc>
+          <w:tcPr>
+            <w:tcW w:type="dxa" w:w="4060"/>
+            <w:tcBorders>
+              <w:top w:val="single" w:color="B7B7B7" w:sz="1"/>
+              <w:left w:val="single" w:color="B7B7B7" w:sz="1"/>
+              <w:bottom w:val="single" w:color="B7B7B7" w:sz="1"/>
+              <w:right w:val="single" w:color="B7B7B7" w:sz="1"/>
+            </w:tcBorders>
+            <w:shd w:fill="FFFFFF" w:val="clear"/>
+            <w:tcMar>
+              <w:top w:type="dxa" w:w="60"/>
+              <w:left w:type="dxa" w:w="110"/>
+              <w:bottom w:type="dxa" w:w="60"/>
+              <w:right w:type="dxa" w:w="110"/>
+            </w:tcMar>
+          </w:tcPr>
+          <w:p>
+            <w:pPr>
+              <w:spacing w:after="0"/>
+            </w:pPr>
+            <w:r>
+              <w:rPr>
+                <w:b w:val="false"/>
+                <w:bCs w:val="false"/>
+                <w:color w:val="1A1A1A"/>
+                <w:sz w:val="18"/>
+                <w:szCs w:val="18"/>
+              </w:rPr>
+              <w:t xml:space="preserve">Optional JSON-RPC import bundle: object creates + a policy package for an ADOM</w:t>
+            </w:r>
+          </w:p>
+        </w:tc>
+        <w:tc>
+          <w:tcPr>
+            <w:tcW w:type="dxa" w:w="3600"/>
+            <w:tcBorders>
+              <w:top w:val="single" w:color="B7B7B7" w:sz="1"/>
+              <w:left w:val="single" w:color="B7B7B7" w:sz="1"/>
+              <w:bottom w:val="single" w:color="B7B7B7" w:sz="1"/>
+              <w:right w:val="single" w:color="B7B7B7" w:sz="1"/>
+            </w:tcBorders>
+            <w:shd w:fill="FFFFFF" w:val="clear"/>
+            <w:tcMar>
+              <w:top w:type="dxa" w:w="60"/>
+              <w:left w:type="dxa" w:w="110"/>
+              <w:bottom w:type="dxa" w:w="60"/>
+              <w:right w:type="dxa" w:w="110"/>
+            </w:tcMar>
+          </w:tcPr>
+          <w:p>
+            <w:pPr>
+              <w:spacing w:after="0"/>
+            </w:pPr>
+            <w:r>
+              <w:rPr>
+                <w:b w:val="false"/>
+                <w:bCs w:val="false"/>
+                <w:color w:val="1A1A1A"/>
+                <w:sz w:val="18"/>
+                <w:szCs w:val="18"/>
+              </w:rPr>
+              <w:t xml:space="preserve"/>
+            </w:r>
+          </w:p>
+        </w:tc>
+      </w:tr>
+      <w:tr>
+        <w:trPr>
+          <w:tblHeader w:val="false"/>
+        </w:trPr>
+        <w:tc>
+          <w:tcPr>
+            <w:tcW w:type="dxa" w:w="1700"/>
+            <w:tcBorders>
+              <w:top w:val="single" w:color="B7B7B7" w:sz="1"/>
+              <w:left w:val="single" w:color="B7B7B7" w:sz="1"/>
+              <w:bottom w:val="single" w:color="B7B7B7" w:sz="1"/>
+              <w:right w:val="single" w:color="B7B7B7" w:sz="1"/>
+            </w:tcBorders>
+            <w:shd w:fill="FFFFFF" w:val="clear"/>
+            <w:tcMar>
+              <w:top w:type="dxa" w:w="60"/>
+              <w:left w:type="dxa" w:w="110"/>
+              <w:bottom w:type="dxa" w:w="60"/>
+              <w:right w:type="dxa" w:w="110"/>
+            </w:tcMar>
+          </w:tcPr>
+          <w:p>
+            <w:pPr>
+              <w:spacing w:after="0"/>
+            </w:pPr>
+            <w:r>
+              <w:rPr>
+                <w:b/>
+                <w:bCs/>
+                <w:color w:val="1A1A1A"/>
+                <w:sz w:val="18"/>
+                <w:szCs w:val="18"/>
+              </w:rPr>
               <w:t xml:space="preserve">Assurance</w:t>
             </w:r>
           </w:p>
@@ -2593,7 +2945,7 @@
         <w:spacing w:after="120"/>
       </w:pPr>
       <w:r>
-        <w:t xml:space="preserve">PAN security profiles split into two groups: those that are category- or type-level (faithfully convertible in a clean-room tool) and those that are signature/engine-level (which are flagged, not guessed).</w:t>
+        <w:t xml:space="preserve">Every PAN security-profile type converts except Data Filtering. A rule's profile-setting (direct refs or a profile-group) resolves to the matching FortiOS UTM profiles, built lazily and deduplicated, and attached to the policy.</w:t>
       </w:r>
     </w:p>
     <w:p>
@@ -2618,10 +2970,10 @@
           <w:b/>
           <w:bCs/>
         </w:rPr>
-        <w:t xml:space="preserve">App-ID → Application Control. </w:t>
-      </w:r>
-      <w:r>
-        <w:t xml:space="preserve">A rule's App-IDs become a FortiOS application-control profile (FortiGuard categories) and, in parallel, a port-based service from the apps' standard ports — so the policy is both port-based and app-aware. Application-groups are expanded to their leaf apps.</w:t>
+        <w:t xml:space="preserve">App-ID → Application Control (per-application). </w:t>
+      </w:r>
+      <w:r>
+        <w:t xml:space="preserve">A rule's App-IDs map to specific FortiOS application signatures via the target's FortiGuard app DB (e.g. Facebook, Microsoft.Teams, Microsoft.365), with FortiGuard categories as the fallback for unmatched apps; in parallel the apps' standard ports fill the policy service. Application-groups expand to their leaf apps.</w:t>
       </w:r>
     </w:p>
     <w:p>
@@ -2641,7 +2993,7 @@
         <w:t xml:space="preserve">URL filtering → Web Filter. </w:t>
       </w:r>
       <w:r>
-        <w:t xml:space="preserve">Each PAN url-filtering profile becomes a FortiOS FortiGuard-category webfilter profile. PAN per-category actions map to ftgd-wf actions; one PAN category can expand to several FortiGuard categories (e.g. alcohol-and-tobacco → Alcohol + Tobacco). Profiles are deduplicated and attached to every policy that referenced them.</w:t>
+        <w:t xml:space="preserve">PAN url-filtering profiles become FortiGuard-category webfilter profiles (one PAN category can expand to several, e.g. alcohol-and-tobacco → Alcohol + Tobacco), and PAN custom-url-category URL lists become a FortiOS webfilter urlfilter table — per-URL allow/block (wildcard or simple) carried over.</w:t>
       </w:r>
     </w:p>
     <w:p>
@@ -2661,7 +3013,7 @@
         <w:t xml:space="preserve">File blocking → File Filter. </w:t>
       </w:r>
       <w:r>
-        <w:t xml:space="preserve">Each PAN file-blocking profile becomes a FortiOS file-filter profile; PAN file types map to FortiOS file types over HTTP/FTP/SMTP/IMAP/POP3/MAPI/CIFS/SSH.</w:t>
+        <w:t xml:space="preserve">PAN file-blocking → FortiOS file-filter; PAN file types map to FortiOS file types over HTTP/FTP/SMTP/IMAP/POP3/MAPI/CIFS/SSH.</w:t>
       </w:r>
     </w:p>
     <w:p>
@@ -2678,34 +3030,10 @@
           <w:b/>
           <w:bCs/>
         </w:rPr>
-        <w:t xml:space="preserve">SSL inspection. </w:t>
-      </w:r>
-      <w:r>
-        <w:t xml:space="preserve">Policies carrying a web or file profile are attached to the built-in certificate-inspection profile (SNI-based, no certificate rollout). Deep-inspection is recommended in the report for full HTTPS content control.</w:t>
-      </w:r>
-    </w:p>
-    <w:p>
-      <w:pPr>
-        <w:pStyle w:val="Heading2"/>
-      </w:pPr>
-      <w:r>
-        <w:t xml:space="preserve">Flagged, not converted (by design)</w:t>
-      </w:r>
-    </w:p>
-    <w:p>
-      <w:pPr>
-        <w:spacing w:after="120"/>
-      </w:pPr>
-      <w:r>
-        <w:t xml:space="preserve">Antivirus, Anti-Spyware, Vulnerability Protection, WildFire, and Data Filtering are signature/engine-level and are reported per rule for manual attachment rather than approximated. PAN risk-level URL buckets (high/medium/low-risk) and any unmapped category or file type are likewise flagged — never silently dropped.</w:t>
-      </w:r>
-    </w:p>
-    <w:p>
-      <w:pPr>
-        <w:pStyle w:val="Heading1"/>
-      </w:pPr>
-      <w:r>
-        <w:t xml:space="preserve">5. Output quality and assurance</w:t>
+        <w:t xml:space="preserve">Antivirus → Antivirus profile. </w:t>
+      </w:r>
+      <w:r>
+        <w:t xml:space="preserve">PAN virus decoders map to per-protocol av-scan (block / monitor / disable). The FortiGuard engine and signatures do the scanning; the per-protocol scan intent is carried.</w:t>
       </w:r>
     </w:p>
     <w:p>
@@ -2722,10 +3050,10 @@
           <w:b/>
           <w:bCs/>
         </w:rPr>
-        <w:t xml:space="preserve">Schema certification. </w:t>
-      </w:r>
-      <w:r>
-        <w:t xml:space="preserve">The emitted CLI is parsed and checked table-by-table, attribute-by-attribute, against the target build's schema. In this review a full PAN→FortiGate conversion certified clean against a live 601F (FortiOS 8.0.0 build0167): 0 unknown tables, 0 unknown attributes.</w:t>
+        <w:t xml:space="preserve">WildFire → FortiSandbox. </w:t>
+      </w:r>
+      <w:r>
+        <w:t xml:space="preserve">A wildfire-analysis reference folds FortiSandbox submission into the rule's antivirus profile (analytics-db + per-protocol fortisandbox). Requires a FortiSandbox appliance or FortiSandbox Cloud (device-level), which the report flags.</w:t>
       </w:r>
     </w:p>
     <w:p>
@@ -2742,10 +3070,10 @@
           <w:b/>
           <w:bCs/>
         </w:rPr>
-        <w:t xml:space="preserve">Deterministic output. </w:t>
-      </w:r>
-      <w:r>
-        <w:t xml:space="preserve">No timestamps or nondeterministic ordering, so successive runs diff cleanly.</w:t>
+        <w:t xml:space="preserve">Anti-Spyware + Vulnerability → IPS sensor. </w:t>
+      </w:r>
+      <w:r>
+        <w:t xml:space="preserve">Merged into one FortiOS IPS sensor: severity rules become severity-filter entries (FortiGuard-recommended action as the baseline), and CVE-pinned rules become exact CVE-filter entries — the one real cross-vendor key (e.g. Log4Shell maps precisely). This is posture parity, not signature-for-signature; per-threat exceptions and DNS sinkhole are flagged (see §6).</w:t>
       </w:r>
     </w:p>
     <w:p>
@@ -2762,10 +3090,34 @@
           <w:b/>
           <w:bCs/>
         </w:rPr>
-        <w:t xml:space="preserve">Structured findings. </w:t>
-      </w:r>
-      <w:r>
-        <w:t xml:space="preserve">Markdown, JSON, and HTML reports, each finding tagged with severity, area, and source file:line. The HTML report is print-to-PDF friendly for hand-off.</w:t>
+        <w:t xml:space="preserve">SSL inspection. </w:t>
+      </w:r>
+      <w:r>
+        <w:t xml:space="preserve">Policies carrying a web / file / AV / IPS profile attach the built-in certificate-inspection profile (SNI-based, no certificate rollout). Deep-inspection is recommended in the report for full HTTPS content control.</w:t>
+      </w:r>
+    </w:p>
+    <w:p>
+      <w:pPr>
+        <w:pStyle w:val="Heading2"/>
+      </w:pPr>
+      <w:r>
+        <w:t xml:space="preserve">Not converted</w:t>
+      </w:r>
+    </w:p>
+    <w:p>
+      <w:pPr>
+        <w:spacing w:after="120"/>
+      </w:pPr>
+      <w:r>
+        <w:t xml:space="preserve">Data Filtering (→ FortiOS DLP) is the only remaining PAN profile type; it is flagged per rule for manual configuration. PAN risk-level URL buckets (high/medium/low-risk) and any unmapped category, file type, or App-ID are likewise flagged — never silently dropped.</w:t>
+      </w:r>
+    </w:p>
+    <w:p>
+      <w:pPr>
+        <w:pStyle w:val="Heading1"/>
+      </w:pPr>
+      <w:r>
+        <w:t xml:space="preserve">5. Output quality and assurance</w:t>
       </w:r>
     </w:p>
     <w:p>
@@ -2782,26 +3134,10 @@
           <w:b/>
           <w:bCs/>
         </w:rPr>
-        <w:t xml:space="preserve">Coverage map. </w:t>
-      </w:r>
-      <w:r>
-        <w:t xml:space="preserve">The parser reports the percentage of source values it read and flags any unread subtree, so reviewers can see what was and was not considered.</w:t>
-      </w:r>
-    </w:p>
-    <w:p>
-      <w:pPr>
-        <w:pStyle w:val="Heading1"/>
-      </w:pPr>
-      <w:r>
-        <w:t xml:space="preserve">6. Scope and limitations (stated plainly)</w:t>
-      </w:r>
-    </w:p>
-    <w:p>
-      <w:pPr>
-        <w:spacing w:after="120"/>
-      </w:pPr>
-      <w:r>
-        <w:t xml:space="preserve">Engineers should know exactly where the tool stops. Each of these is surfaced in the report; nothing fails silently.</w:t>
+        <w:t xml:space="preserve">Schema certification. </w:t>
+      </w:r>
+      <w:r>
+        <w:t xml:space="preserve">The emitted CLI is parsed and checked table-by-table, attribute-by-attribute, against the target build's schema. In this review a full PAN→FortiGate conversion certified clean against a live 601F (FortiOS 8.0.0 build0167): 0 unknown tables, 0 unknown attributes.</w:t>
       </w:r>
     </w:p>
     <w:p>
@@ -2818,10 +3154,10 @@
           <w:b/>
           <w:bCs/>
         </w:rPr>
-        <w:t xml:space="preserve">Category-level App-ID and URL mapping. </w:t>
-      </w:r>
-      <w:r>
-        <w:t xml:space="preserve">fwforge maps to FortiOS application-control and FortiGuard web categories, not per-application or per-URL signatures. The PAN-app → FortiGuard-signature-ID table is licensed and cannot be used in a clean-room tool, so this is coarser than FortiConverter's licensed mapping. With a Fortinet-sanctioned mapping, fwforge could emit signature-level profiles — a natural collaboration point.</w:t>
+        <w:t xml:space="preserve">Deterministic output. </w:t>
+      </w:r>
+      <w:r>
+        <w:t xml:space="preserve">No timestamps or nondeterministic ordering, so successive runs diff cleanly.</w:t>
       </w:r>
     </w:p>
     <w:p>
@@ -2838,10 +3174,126 @@
           <w:b/>
           <w:bCs/>
         </w:rPr>
-        <w:t xml:space="preserve">Engine-level profiles. </w:t>
-      </w:r>
-      <w:r>
-        <w:t xml:space="preserve">Antivirus, IPS (Anti-Spyware / Vulnerability), WildFire, and Data Filtering are not converted (see §4).</w:t>
+        <w:t xml:space="preserve">Structured findings. </w:t>
+      </w:r>
+      <w:r>
+        <w:t xml:space="preserve">Markdown, JSON, and HTML reports, each finding tagged with severity, area, and source file:line. The HTML report is print-to-PDF friendly for hand-off.</w:t>
+      </w:r>
+    </w:p>
+    <w:p>
+      <w:pPr>
+        <w:pStyle w:val="ListParagraph"/>
+        <w:numPr>
+          <w:ilvl w:val="0"/>
+          <w:numId w:val="2"/>
+        </w:numPr>
+        <w:spacing w:after="60"/>
+      </w:pPr>
+      <w:r>
+        <w:rPr>
+          <w:b/>
+          <w:bCs/>
+        </w:rPr>
+        <w:t xml:space="preserve">Coverage map. </w:t>
+      </w:r>
+      <w:r>
+        <w:t xml:space="preserve">The parser reports the percentage of source values it read and flags any unread subtree, so reviewers can see what was and was not considered.</w:t>
+      </w:r>
+    </w:p>
+    <w:p>
+      <w:pPr>
+        <w:pStyle w:val="Heading1"/>
+      </w:pPr>
+      <w:r>
+        <w:t xml:space="preserve">6. Scope and limitations (stated plainly)</w:t>
+      </w:r>
+    </w:p>
+    <w:p>
+      <w:pPr>
+        <w:spacing w:after="120"/>
+      </w:pPr>
+      <w:r>
+        <w:t xml:space="preserve">Engineers should know exactly where the tool stops. Each of these is surfaced in the report; nothing fails silently.</w:t>
+      </w:r>
+    </w:p>
+    <w:p>
+      <w:pPr>
+        <w:pStyle w:val="ListParagraph"/>
+        <w:numPr>
+          <w:ilvl w:val="0"/>
+          <w:numId w:val="2"/>
+        </w:numPr>
+        <w:spacing w:after="60"/>
+      </w:pPr>
+      <w:r>
+        <w:rPr>
+          <w:b/>
+          <w:bCs/>
+        </w:rPr>
+        <w:t xml:space="preserve">IPS is posture parity, not signature parity. </w:t>
+      </w:r>
+      <w:r>
+        <w:t xml:space="preserve">There is no Palo Alto Threat-ID → FortiGuard-signature crosswalk — for any tool — so PAN anti-spyware / vulnerability profiles map at the severity + CVE level (with FortiGuard's recommended action as the baseline), not signature-for-signature. CVE-pinned rules map exactly; per-threat exceptions and DNS sinkhole are flagged for manual review. Validate IPS before enforcing.</w:t>
+      </w:r>
+    </w:p>
+    <w:p>
+      <w:pPr>
+        <w:pStyle w:val="ListParagraph"/>
+        <w:numPr>
+          <w:ilvl w:val="0"/>
+          <w:numId w:val="2"/>
+        </w:numPr>
+        <w:spacing w:after="60"/>
+      </w:pPr>
+      <w:r>
+        <w:rPr>
+          <w:b/>
+          <w:bCs/>
+        </w:rPr>
+        <w:t xml:space="preserve">App-ID DB freshness. </w:t>
+      </w:r>
+      <w:r>
+        <w:t xml:space="preserve">Per-application App-ID uses the target FortiGate's FortiGuard signature DB, cached locally; conversions are deterministic and offline and do not refetch per run. FortiGuard adds App-IDs continuously, so the tool warns when the cache is stale — refresh with one read-only call.</w:t>
+      </w:r>
+    </w:p>
+    <w:p>
+      <w:pPr>
+        <w:pStyle w:val="ListParagraph"/>
+        <w:numPr>
+          <w:ilvl w:val="0"/>
+          <w:numId w:val="2"/>
+        </w:numPr>
+        <w:spacing w:after="60"/>
+      </w:pPr>
+      <w:r>
+        <w:rPr>
+          <w:b/>
+          <w:bCs/>
+        </w:rPr>
+        <w:t xml:space="preserve">Data Filtering → DLP. </w:t>
+      </w:r>
+      <w:r>
+        <w:t xml:space="preserve">The only PAN security-profile type not yet converted; flagged per rule. FortiOS ships the building blocks (DLP profiles + def-cc / def-ssn dictionaries) so this is a planned addition.</w:t>
+      </w:r>
+    </w:p>
+    <w:p>
+      <w:pPr>
+        <w:pStyle w:val="ListParagraph"/>
+        <w:numPr>
+          <w:ilvl w:val="0"/>
+          <w:numId w:val="2"/>
+        </w:numPr>
+        <w:spacing w:after="60"/>
+      </w:pPr>
+      <w:r>
+        <w:rPr>
+          <w:b/>
+          <w:bCs/>
+        </w:rPr>
+        <w:t xml:space="preserve">FortiSandbox is a device dependency. </w:t>
+      </w:r>
+      <w:r>
+        <w:t xml:space="preserve">WildFire conversion enables FortiSandbox submission in the AV profile, but a FortiSandbox appliance or Cloud must be configured device-level (config system fortisandbox) — outside the converted policy package.</w:t>
       </w:r>
     </w:p>
     <w:p>
@@ -3163,7 +3615,7 @@
                 <w:sz w:val="18"/>
                 <w:szCs w:val="18"/>
               </w:rPr>
-              <w:t xml:space="preserve">App-ID / URL granularity</w:t>
+              <w:t xml:space="preserve">App-ID granularity</w:t>
             </w:r>
           </w:p>
         </w:tc>
@@ -3196,7 +3648,7 @@
                 <w:sz w:val="18"/>
                 <w:szCs w:val="18"/>
               </w:rPr>
-              <w:t xml:space="preserve">Category-level (public IDs, clean-room)</w:t>
+              <w:t xml:space="preserve">Per-application signatures from the target's own FortiGuard DB (live, refreshable) + category fallback</w:t>
             </w:r>
           </w:p>
         </w:tc>
@@ -3229,7 +3681,7 @@
                 <w:sz w:val="18"/>
                 <w:szCs w:val="18"/>
               </w:rPr>
-              <w:t xml:space="preserve">Signature-level (licensed FortiGuard table) — finer</w:t>
+              <w:t xml:space="preserve">Per-application signatures from a bundled licensed table</w:t>
             </w:r>
           </w:p>
         </w:tc>
@@ -3267,7 +3719,7 @@
                 <w:sz w:val="18"/>
                 <w:szCs w:val="18"/>
               </w:rPr>
-              <w:t xml:space="preserve">Output validation</w:t>
+              <w:t xml:space="preserve">Security profiles</w:t>
             </w:r>
           </w:p>
         </w:tc>
@@ -3300,7 +3752,7 @@
                 <w:sz w:val="18"/>
                 <w:szCs w:val="18"/>
               </w:rPr>
-              <w:t xml:space="preserve">Schema-certified against the exact target firmware build</w:t>
+              <w:t xml:space="preserve">App-ID, URL (categories + URL lists), file, AV, WildFire→FortiSandbox, IPS — schema-certified; DLP pending</w:t>
             </w:r>
           </w:p>
         </w:tc>
@@ -3333,7 +3785,7 @@
                 <w:sz w:val="18"/>
                 <w:szCs w:val="18"/>
               </w:rPr>
-              <w:t xml:space="preserve">Not certified against the live target schema</w:t>
+              <w:t xml:space="preserve">Broad profile coverage incl. DLP</w:t>
             </w:r>
           </w:p>
         </w:tc>
@@ -3371,7 +3823,7 @@
                 <w:sz w:val="18"/>
                 <w:szCs w:val="18"/>
               </w:rPr>
-              <w:t xml:space="preserve">Determinism</w:t>
+              <w:t xml:space="preserve">IPS conversion</w:t>
             </w:r>
           </w:p>
         </w:tc>
@@ -3404,7 +3856,7 @@
                 <w:sz w:val="18"/>
                 <w:szCs w:val="18"/>
               </w:rPr>
-              <w:t xml:space="preserve">Byte-deterministic, git-diffable</w:t>
+              <w:t xml:space="preserve">Severity + exact CVE crosswalk + FortiGuard-recommended baseline; posture-parity, stated plainly</w:t>
             </w:r>
           </w:p>
         </w:tc>
@@ -3437,7 +3889,7 @@
                 <w:sz w:val="18"/>
                 <w:szCs w:val="18"/>
               </w:rPr>
-              <w:t xml:space="preserve">Not deterministic</w:t>
+              <w:t xml:space="preserve">No PA Threat-ID → FortiGuard signature crosswalk exists for either tool</w:t>
             </w:r>
           </w:p>
         </w:tc>
@@ -3475,7 +3927,7 @@
                 <w:sz w:val="18"/>
                 <w:szCs w:val="18"/>
               </w:rPr>
-              <w:t xml:space="preserve">Provenance / findings</w:t>
+              <w:t xml:space="preserve">Output validation</w:t>
             </w:r>
           </w:p>
         </w:tc>
@@ -3508,7 +3960,7 @@
                 <w:sz w:val="18"/>
                 <w:szCs w:val="18"/>
               </w:rPr>
-              <w:t xml:space="preserve">Per-line source provenance; md/JSON/HTML report; non-zero exit on error</w:t>
+              <w:t xml:space="preserve">Schema-certified against the exact target firmware build</w:t>
             </w:r>
           </w:p>
         </w:tc>
@@ -3541,7 +3993,7 @@
                 <w:sz w:val="18"/>
                 <w:szCs w:val="18"/>
               </w:rPr>
-              <w:t xml:space="preserve">Warnings as comments in config-all.txt</w:t>
+              <w:t xml:space="preserve">Not certified against the live target schema</w:t>
             </w:r>
           </w:p>
         </w:tc>
@@ -3579,7 +4031,7 @@
                 <w:sz w:val="18"/>
                 <w:szCs w:val="18"/>
               </w:rPr>
-              <w:t xml:space="preserve">Version-delta scan</w:t>
+              <w:t xml:space="preserve">Determinism</w:t>
             </w:r>
           </w:p>
         </w:tc>
@@ -3612,7 +4064,7 @@
                 <w:sz w:val="18"/>
                 <w:szCs w:val="18"/>
               </w:rPr>
-              <w:t xml:space="preserve">Yes — bidirectional feature / rename / default-flip</w:t>
+              <w:t xml:space="preserve">Byte-deterministic, git-diffable</w:t>
             </w:r>
           </w:p>
         </w:tc>
@@ -3645,7 +4097,7 @@
                 <w:sz w:val="18"/>
                 <w:szCs w:val="18"/>
               </w:rPr>
-              <w:t xml:space="preserve">No</w:t>
+              <w:t xml:space="preserve">Not deterministic</w:t>
             </w:r>
           </w:p>
         </w:tc>
@@ -3683,7 +4135,7 @@
                 <w:sz w:val="18"/>
                 <w:szCs w:val="18"/>
               </w:rPr>
-              <w:t xml:space="preserve">Object hygiene</w:t>
+              <w:t xml:space="preserve">Provenance / findings</w:t>
             </w:r>
           </w:p>
         </w:tc>
@@ -3716,7 +4168,7 @@
                 <w:sz w:val="18"/>
                 <w:szCs w:val="18"/>
               </w:rPr>
-              <w:t xml:space="preserve">Prunes, merges, dedups (acts on output)</w:t>
+              <w:t xml:space="preserve">Per-line source provenance; md/JSON/HTML report; non-zero exit on error</w:t>
             </w:r>
           </w:p>
         </w:tc>
@@ -3749,7 +4201,7 @@
                 <w:sz w:val="18"/>
                 <w:szCs w:val="18"/>
               </w:rPr>
-              <w:t xml:space="preserve">Reports; discard is opt-in</w:t>
+              <w:t xml:space="preserve">Warnings as comments in config-all.txt</w:t>
             </w:r>
           </w:p>
         </w:tc>
@@ -3787,7 +4239,7 @@
                 <w:sz w:val="18"/>
                 <w:szCs w:val="18"/>
               </w:rPr>
-              <w:t xml:space="preserve">Routing-aware dstintf</w:t>
+              <w:t xml:space="preserve">Version-delta scan</w:t>
             </w:r>
           </w:p>
         </w:tc>
@@ -3820,7 +4272,7 @@
                 <w:sz w:val="18"/>
                 <w:szCs w:val="18"/>
               </w:rPr>
-              <w:t xml:space="preserve">Longest-prefix-match from source routes</w:t>
+              <w:t xml:space="preserve">Yes — bidirectional feature / rename / default-flip</w:t>
             </w:r>
           </w:p>
         </w:tc>
@@ -3853,7 +4305,7 @@
                 <w:sz w:val="18"/>
                 <w:szCs w:val="18"/>
               </w:rPr>
-              <w:t xml:space="preserve">Falls back to any when missing (per docs)</w:t>
+              <w:t xml:space="preserve">No</w:t>
             </w:r>
           </w:p>
         </w:tc>
@@ -3891,7 +4343,7 @@
                 <w:sz w:val="18"/>
                 <w:szCs w:val="18"/>
               </w:rPr>
-              <w:t xml:space="preserve">Deployment</w:t>
+              <w:t xml:space="preserve">Object hygiene</w:t>
             </w:r>
           </w:p>
         </w:tc>
@@ -3924,7 +4376,7 @@
                 <w:sz w:val="18"/>
                 <w:szCs w:val="18"/>
               </w:rPr>
-              <w:t xml:space="preserve">Single local package, fully offline</w:t>
+              <w:t xml:space="preserve">Prunes, merges, dedups (acts on output)</w:t>
             </w:r>
           </w:p>
         </w:tc>
@@ -3957,7 +4409,7 @@
                 <w:sz w:val="18"/>
                 <w:szCs w:val="18"/>
               </w:rPr>
-              <w:t xml:space="preserve">Heavier install; FGT→FGT path runs in cloud</w:t>
+              <w:t xml:space="preserve">Reports; discard is opt-in</w:t>
             </w:r>
           </w:p>
         </w:tc>
@@ -3995,7 +4447,7 @@
                 <w:sz w:val="18"/>
                 <w:szCs w:val="18"/>
               </w:rPr>
-              <w:t xml:space="preserve">FortiManager output</w:t>
+              <w:t xml:space="preserve">Routing-aware dstintf</w:t>
             </w:r>
           </w:p>
         </w:tc>
@@ -4028,7 +4480,7 @@
                 <w:sz w:val="18"/>
                 <w:szCs w:val="18"/>
               </w:rPr>
-              <w:t xml:space="preserve">JSON-RPC import bundle (objects + package)</w:t>
+              <w:t xml:space="preserve">Longest-prefix-match from source routes</w:t>
             </w:r>
           </w:p>
         </w:tc>
@@ -4061,7 +4513,7 @@
                 <w:sz w:val="18"/>
                 <w:szCs w:val="18"/>
               </w:rPr>
-              <w:t xml:space="preserve">Yes — mature</w:t>
+              <w:t xml:space="preserve">Falls back to any when missing (per docs)</w:t>
             </w:r>
           </w:p>
         </w:tc>
@@ -4099,6 +4551,214 @@
                 <w:sz w:val="18"/>
                 <w:szCs w:val="18"/>
               </w:rPr>
+              <w:t xml:space="preserve">Deployment</w:t>
+            </w:r>
+          </w:p>
+        </w:tc>
+        <w:tc>
+          <w:tcPr>
+            <w:tcW w:type="dxa" w:w="3520"/>
+            <w:tcBorders>
+              <w:top w:val="single" w:color="B7B7B7" w:sz="1"/>
+              <w:left w:val="single" w:color="B7B7B7" w:sz="1"/>
+              <w:bottom w:val="single" w:color="B7B7B7" w:sz="1"/>
+              <w:right w:val="single" w:color="B7B7B7" w:sz="1"/>
+            </w:tcBorders>
+            <w:shd w:fill="FFFFFF" w:val="clear"/>
+            <w:tcMar>
+              <w:top w:type="dxa" w:w="60"/>
+              <w:left w:type="dxa" w:w="110"/>
+              <w:bottom w:type="dxa" w:w="60"/>
+              <w:right w:type="dxa" w:w="110"/>
+            </w:tcMar>
+          </w:tcPr>
+          <w:p>
+            <w:pPr>
+              <w:spacing w:after="0"/>
+            </w:pPr>
+            <w:r>
+              <w:rPr>
+                <w:b w:val="false"/>
+                <w:bCs w:val="false"/>
+                <w:color w:val="1A1A1A"/>
+                <w:sz w:val="18"/>
+                <w:szCs w:val="18"/>
+              </w:rPr>
+              <w:t xml:space="preserve">Single local package, fully offline</w:t>
+            </w:r>
+          </w:p>
+        </w:tc>
+        <w:tc>
+          <w:tcPr>
+            <w:tcW w:type="dxa" w:w="3280"/>
+            <w:tcBorders>
+              <w:top w:val="single" w:color="B7B7B7" w:sz="1"/>
+              <w:left w:val="single" w:color="B7B7B7" w:sz="1"/>
+              <w:bottom w:val="single" w:color="B7B7B7" w:sz="1"/>
+              <w:right w:val="single" w:color="B7B7B7" w:sz="1"/>
+            </w:tcBorders>
+            <w:shd w:fill="FFFFFF" w:val="clear"/>
+            <w:tcMar>
+              <w:top w:type="dxa" w:w="60"/>
+              <w:left w:type="dxa" w:w="110"/>
+              <w:bottom w:type="dxa" w:w="60"/>
+              <w:right w:type="dxa" w:w="110"/>
+            </w:tcMar>
+          </w:tcPr>
+          <w:p>
+            <w:pPr>
+              <w:spacing w:after="0"/>
+            </w:pPr>
+            <w:r>
+              <w:rPr>
+                <w:b w:val="false"/>
+                <w:bCs w:val="false"/>
+                <w:color w:val="1A1A1A"/>
+                <w:sz w:val="18"/>
+                <w:szCs w:val="18"/>
+              </w:rPr>
+              <w:t xml:space="preserve">Heavier install; FGT→FGT path runs in cloud</w:t>
+            </w:r>
+          </w:p>
+        </w:tc>
+      </w:tr>
+      <w:tr>
+        <w:trPr>
+          <w:tblHeader w:val="false"/>
+        </w:trPr>
+        <w:tc>
+          <w:tcPr>
+            <w:tcW w:type="dxa" w:w="2560"/>
+            <w:tcBorders>
+              <w:top w:val="single" w:color="B7B7B7" w:sz="1"/>
+              <w:left w:val="single" w:color="B7B7B7" w:sz="1"/>
+              <w:bottom w:val="single" w:color="B7B7B7" w:sz="1"/>
+              <w:right w:val="single" w:color="B7B7B7" w:sz="1"/>
+            </w:tcBorders>
+            <w:shd w:fill="FFFFFF" w:val="clear"/>
+            <w:tcMar>
+              <w:top w:type="dxa" w:w="60"/>
+              <w:left w:type="dxa" w:w="110"/>
+              <w:bottom w:type="dxa" w:w="60"/>
+              <w:right w:type="dxa" w:w="110"/>
+            </w:tcMar>
+          </w:tcPr>
+          <w:p>
+            <w:pPr>
+              <w:spacing w:after="0"/>
+            </w:pPr>
+            <w:r>
+              <w:rPr>
+                <w:b/>
+                <w:bCs/>
+                <w:color w:val="1A1A1A"/>
+                <w:sz w:val="18"/>
+                <w:szCs w:val="18"/>
+              </w:rPr>
+              <w:t xml:space="preserve">FortiManager output</w:t>
+            </w:r>
+          </w:p>
+        </w:tc>
+        <w:tc>
+          <w:tcPr>
+            <w:tcW w:type="dxa" w:w="3520"/>
+            <w:tcBorders>
+              <w:top w:val="single" w:color="B7B7B7" w:sz="1"/>
+              <w:left w:val="single" w:color="B7B7B7" w:sz="1"/>
+              <w:bottom w:val="single" w:color="B7B7B7" w:sz="1"/>
+              <w:right w:val="single" w:color="B7B7B7" w:sz="1"/>
+            </w:tcBorders>
+            <w:shd w:fill="FFFFFF" w:val="clear"/>
+            <w:tcMar>
+              <w:top w:type="dxa" w:w="60"/>
+              <w:left w:type="dxa" w:w="110"/>
+              <w:bottom w:type="dxa" w:w="60"/>
+              <w:right w:type="dxa" w:w="110"/>
+            </w:tcMar>
+          </w:tcPr>
+          <w:p>
+            <w:pPr>
+              <w:spacing w:after="0"/>
+            </w:pPr>
+            <w:r>
+              <w:rPr>
+                <w:b w:val="false"/>
+                <w:bCs w:val="false"/>
+                <w:color w:val="1A1A1A"/>
+                <w:sz w:val="18"/>
+                <w:szCs w:val="18"/>
+              </w:rPr>
+              <w:t xml:space="preserve">JSON-RPC import bundle (objects + package)</w:t>
+            </w:r>
+          </w:p>
+        </w:tc>
+        <w:tc>
+          <w:tcPr>
+            <w:tcW w:type="dxa" w:w="3280"/>
+            <w:tcBorders>
+              <w:top w:val="single" w:color="B7B7B7" w:sz="1"/>
+              <w:left w:val="single" w:color="B7B7B7" w:sz="1"/>
+              <w:bottom w:val="single" w:color="B7B7B7" w:sz="1"/>
+              <w:right w:val="single" w:color="B7B7B7" w:sz="1"/>
+            </w:tcBorders>
+            <w:shd w:fill="FFFFFF" w:val="clear"/>
+            <w:tcMar>
+              <w:top w:type="dxa" w:w="60"/>
+              <w:left w:type="dxa" w:w="110"/>
+              <w:bottom w:type="dxa" w:w="60"/>
+              <w:right w:type="dxa" w:w="110"/>
+            </w:tcMar>
+          </w:tcPr>
+          <w:p>
+            <w:pPr>
+              <w:spacing w:after="0"/>
+            </w:pPr>
+            <w:r>
+              <w:rPr>
+                <w:b w:val="false"/>
+                <w:bCs w:val="false"/>
+                <w:color w:val="1A1A1A"/>
+                <w:sz w:val="18"/>
+                <w:szCs w:val="18"/>
+              </w:rPr>
+              <w:t xml:space="preserve">Yes — mature</w:t>
+            </w:r>
+          </w:p>
+        </w:tc>
+      </w:tr>
+      <w:tr>
+        <w:trPr>
+          <w:tblHeader w:val="false"/>
+        </w:trPr>
+        <w:tc>
+          <w:tcPr>
+            <w:tcW w:type="dxa" w:w="2560"/>
+            <w:tcBorders>
+              <w:top w:val="single" w:color="B7B7B7" w:sz="1"/>
+              <w:left w:val="single" w:color="B7B7B7" w:sz="1"/>
+              <w:bottom w:val="single" w:color="B7B7B7" w:sz="1"/>
+              <w:right w:val="single" w:color="B7B7B7" w:sz="1"/>
+            </w:tcBorders>
+            <w:shd w:fill="FFFFFF" w:val="clear"/>
+            <w:tcMar>
+              <w:top w:type="dxa" w:w="60"/>
+              <w:left w:type="dxa" w:w="110"/>
+              <w:bottom w:type="dxa" w:w="60"/>
+              <w:right w:type="dxa" w:w="110"/>
+            </w:tcMar>
+          </w:tcPr>
+          <w:p>
+            <w:pPr>
+              <w:spacing w:after="0"/>
+            </w:pPr>
+            <w:r>
+              <w:rPr>
+                <w:b/>
+                <w:bCs/>
+                <w:color w:val="1A1A1A"/>
+                <w:sz w:val="18"/>
+                <w:szCs w:val="18"/>
+              </w:rPr>
               <w:t xml:space="preserve">Support model</w:t>
             </w:r>
           </w:p>
@@ -4183,7 +4843,7 @@
         <w:t xml:space="preserve">Where FortiConverter leads: </w:t>
       </w:r>
       <w:r>
-        <w:t xml:space="preserve">vendor breadth, signature-level App-ID/URL mapping, official support, and product maturity. </w:t>
+        <w:t xml:space="preserve">vendor breadth, Data Filtering → DLP today, official support, and product maturity. </w:t>
       </w:r>
       <w:r>
         <w:rPr>
@@ -4193,7 +4853,7 @@
         <w:t xml:space="preserve">Where fwforge leads: </w:t>
       </w:r>
       <w:r>
-        <w:t xml:space="preserve">output assurance (schema certification), transparency, determinism, provenance, version-delta awareness, active hygiene, and fully-local operation.</w:t>
+        <w:t xml:space="preserve">output assurance (schema certification against the exact build), transparency, determinism, per-line provenance, version-delta awareness, active hygiene, fully-local operation, and App-ID / profile mappings sourced live from your own FortiGate rather than a bundled table.</w:t>
       </w:r>
     </w:p>
     <w:p>
@@ -4209,7 +4869,7 @@
         <w:spacing w:after="120"/>
       </w:pPr>
       <w:r>
-        <w:t xml:space="preserve">A PAN physical port carrying VLANs, promoted to a LAG, with a url-filtering profile — as emitted (and schema-certified clean) by fwforge:</w:t>
+        <w:t xml:space="preserve">An emitted, schema-certified excerpt showing per-application App-ID signatures, the IPS CVE crosswalk, and a policy carrying the full UTM stack:</w:t>
       </w:r>
     </w:p>
     <w:tbl>
@@ -4255,7 +4915,7 @@
                 <w:sz w:val="16"/>
                 <w:szCs w:val="16"/>
               </w:rPr>
-              <w:t xml:space="preserve">config system interface</w:t>
+              <w:t xml:space="preserve">config application list</w:t>
             </w:r>
           </w:p>
           <w:p>
@@ -4268,7 +4928,7 @@
                 <w:sz w:val="16"/>
                 <w:szCs w:val="16"/>
               </w:rPr>
-              <w:t xml:space="preserve">    edit "lag-uplink"</w:t>
+              <w:t xml:space="preserve">    edit "pan-appctrl-1"</w:t>
             </w:r>
           </w:p>
           <w:p>
@@ -4281,7 +4941,7 @@
                 <w:sz w:val="16"/>
                 <w:szCs w:val="16"/>
               </w:rPr>
-              <w:t xml:space="preserve">        set type aggregate</w:t>
+              <w:t xml:space="preserve">        set other-application-action block</w:t>
             </w:r>
           </w:p>
           <w:p>
@@ -4294,7 +4954,7 @@
                 <w:sz w:val="16"/>
                 <w:szCs w:val="16"/>
               </w:rPr>
-              <w:t xml:space="preserve">        set member "port5" "port6"</w:t>
+              <w:t xml:space="preserve">        config entries</w:t>
             </w:r>
           </w:p>
           <w:p>
@@ -4307,7 +4967,7 @@
                 <w:sz w:val="16"/>
                 <w:szCs w:val="16"/>
               </w:rPr>
-              <w:t xml:space="preserve">        set lacp-mode active</w:t>
+              <w:t xml:space="preserve">            edit 1</w:t>
             </w:r>
           </w:p>
           <w:p>
@@ -4320,7 +4980,7 @@
                 <w:sz w:val="16"/>
                 <w:szCs w:val="16"/>
               </w:rPr>
-              <w:t xml:space="preserve">    next</w:t>
+              <w:t xml:space="preserve">                set application 15832 15817 37065   # Facebook, Gmail, Zoom</w:t>
             </w:r>
           </w:p>
           <w:p>
@@ -4333,7 +4993,7 @@
                 <w:sz w:val="16"/>
                 <w:szCs w:val="16"/>
               </w:rPr>
-              <w:t xml:space="preserve">    edit "vlan100"</w:t>
+              <w:t xml:space="preserve">                set action pass</w:t>
             </w:r>
           </w:p>
           <w:p>
@@ -4346,7 +5006,7 @@
                 <w:sz w:val="16"/>
                 <w:szCs w:val="16"/>
               </w:rPr>
-              <w:t xml:space="preserve">        set type vlan</w:t>
+              <w:t xml:space="preserve">            next</w:t>
             </w:r>
           </w:p>
           <w:p>
@@ -4359,7 +5019,7 @@
                 <w:sz w:val="16"/>
                 <w:szCs w:val="16"/>
               </w:rPr>
-              <w:t xml:space="preserve">        set interface "lag-uplink"      # rides the LAG; emitted after it</w:t>
+              <w:t xml:space="preserve">        end</w:t>
             </w:r>
           </w:p>
           <w:p>
@@ -4372,7 +5032,7 @@
                 <w:sz w:val="16"/>
                 <w:szCs w:val="16"/>
               </w:rPr>
-              <w:t xml:space="preserve">        set vlanid 100</w:t>
+              <w:t xml:space="preserve">    next</w:t>
             </w:r>
           </w:p>
           <w:p>
@@ -4385,7 +5045,7 @@
                 <w:sz w:val="16"/>
                 <w:szCs w:val="16"/>
               </w:rPr>
-              <w:t xml:space="preserve">    next</w:t>
+              <w:t xml:space="preserve">end</w:t>
             </w:r>
           </w:p>
           <w:p>
@@ -4398,7 +5058,7 @@
                 <w:sz w:val="16"/>
                 <w:szCs w:val="16"/>
               </w:rPr>
-              <w:t xml:space="preserve">end</w:t>
+              <w:t xml:space="preserve"> </w:t>
             </w:r>
           </w:p>
           <w:p>
@@ -4411,7 +5071,7 @@
                 <w:sz w:val="16"/>
                 <w:szCs w:val="16"/>
               </w:rPr>
-              <w:t xml:space="preserve"> </w:t>
+              <w:t xml:space="preserve">config ips sensor</w:t>
             </w:r>
           </w:p>
           <w:p>
@@ -4424,7 +5084,7 @@
                 <w:sz w:val="16"/>
                 <w:szCs w:val="16"/>
               </w:rPr>
-              <w:t xml:space="preserve">config webfilter profile</w:t>
+              <w:t xml:space="preserve">    edit "ips-vuln-strict-spy-strict"</w:t>
             </w:r>
           </w:p>
           <w:p>
@@ -4437,7 +5097,7 @@
                 <w:sz w:val="16"/>
                 <w:szCs w:val="16"/>
               </w:rPr>
-              <w:t xml:space="preserve">    edit "wf-url-strict"</w:t>
+              <w:t xml:space="preserve">        config entries</w:t>
             </w:r>
           </w:p>
           <w:p>
@@ -4450,7 +5110,7 @@
                 <w:sz w:val="16"/>
                 <w:szCs w:val="16"/>
               </w:rPr>
-              <w:t xml:space="preserve">        config ftgd-wf</w:t>
+              <w:t xml:space="preserve">            edit 1</w:t>
             </w:r>
           </w:p>
           <w:p>
@@ -4463,7 +5123,7 @@
                 <w:sz w:val="16"/>
                 <w:szCs w:val="16"/>
               </w:rPr>
-              <w:t xml:space="preserve">            config filters</w:t>
+              <w:t xml:space="preserve">                set severity critical high</w:t>
             </w:r>
           </w:p>
           <w:p>
@@ -4476,7 +5136,7 @@
                 <w:sz w:val="16"/>
                 <w:szCs w:val="16"/>
               </w:rPr>
-              <w:t xml:space="preserve">                edit 1</w:t>
+              <w:t xml:space="preserve">                set action reset</w:t>
             </w:r>
           </w:p>
           <w:p>
@@ -4489,7 +5149,7 @@
                 <w:sz w:val="16"/>
                 <w:szCs w:val="16"/>
               </w:rPr>
-              <w:t xml:space="preserve">                    set category 26       # Malicious Websites</w:t>
+              <w:t xml:space="preserve">            next</w:t>
             </w:r>
           </w:p>
           <w:p>
@@ -4502,7 +5162,7 @@
                 <w:sz w:val="16"/>
                 <w:szCs w:val="16"/>
               </w:rPr>
-              <w:t xml:space="preserve">                    set action block</w:t>
+              <w:t xml:space="preserve">            edit 2</w:t>
             </w:r>
           </w:p>
           <w:p>
@@ -4515,7 +5175,7 @@
                 <w:sz w:val="16"/>
                 <w:szCs w:val="16"/>
               </w:rPr>
-              <w:t xml:space="preserve">                next</w:t>
+              <w:t xml:space="preserve">                set cve CVE-2021-44228          # Log4Shell — exact cross-vendor match</w:t>
             </w:r>
           </w:p>
           <w:p>
@@ -4528,7 +5188,7 @@
                 <w:sz w:val="16"/>
                 <w:szCs w:val="16"/>
               </w:rPr>
-              <w:t xml:space="preserve">            end</w:t>
+              <w:t xml:space="preserve">                set action reset</w:t>
             </w:r>
           </w:p>
           <w:p>
@@ -4541,7 +5201,7 @@
                 <w:sz w:val="16"/>
                 <w:szCs w:val="16"/>
               </w:rPr>
-              <w:t xml:space="preserve">        end</w:t>
+              <w:t xml:space="preserve">            next</w:t>
             </w:r>
           </w:p>
           <w:p>
@@ -4554,7 +5214,7 @@
                 <w:sz w:val="16"/>
                 <w:szCs w:val="16"/>
               </w:rPr>
-              <w:t xml:space="preserve">    next</w:t>
+              <w:t xml:space="preserve">        end</w:t>
             </w:r>
           </w:p>
           <w:p>
@@ -4567,7 +5227,7 @@
                 <w:sz w:val="16"/>
                 <w:szCs w:val="16"/>
               </w:rPr>
-              <w:t xml:space="preserve">end</w:t>
+              <w:t xml:space="preserve">    next</w:t>
             </w:r>
           </w:p>
           <w:p>
@@ -4580,7 +5240,7 @@
                 <w:sz w:val="16"/>
                 <w:szCs w:val="16"/>
               </w:rPr>
-              <w:t xml:space="preserve"> </w:t>
+              <w:t xml:space="preserve">end</w:t>
             </w:r>
           </w:p>
           <w:p>
@@ -4593,7 +5253,7 @@
                 <w:sz w:val="16"/>
                 <w:szCs w:val="16"/>
               </w:rPr>
-              <w:t xml:space="preserve">config firewall policy</w:t>
+              <w:t xml:space="preserve"> </w:t>
             </w:r>
           </w:p>
           <w:p>
@@ -4606,7 +5266,7 @@
                 <w:sz w:val="16"/>
                 <w:szCs w:val="16"/>
               </w:rPr>
-              <w:t xml:space="preserve">    edit 1</w:t>
+              <w:t xml:space="preserve">config firewall policy</w:t>
             </w:r>
           </w:p>
           <w:p>
@@ -4619,7 +5279,7 @@
                 <w:sz w:val="16"/>
                 <w:szCs w:val="16"/>
               </w:rPr>
-              <w:t xml:space="preserve">        set name "trust-to-untrust"</w:t>
+              <w:t xml:space="preserve">    edit 1</w:t>
             </w:r>
           </w:p>
           <w:p>
@@ -4632,7 +5292,7 @@
                 <w:sz w:val="16"/>
                 <w:szCs w:val="16"/>
               </w:rPr>
-              <w:t xml:space="preserve">        set utm-status enable</w:t>
+              <w:t xml:space="preserve">        set name "trust-to-untrust"</w:t>
             </w:r>
           </w:p>
           <w:p>
@@ -4645,7 +5305,59 @@
                 <w:sz w:val="16"/>
                 <w:szCs w:val="16"/>
               </w:rPr>
+              <w:t xml:space="preserve">        set utm-status enable</w:t>
+            </w:r>
+          </w:p>
+          <w:p>
+            <w:pPr>
+              <w:spacing w:after="0"/>
+            </w:pPr>
+            <w:r>
+              <w:rPr>
+                <w:rFonts w:ascii="Consolas" w:cs="Consolas" w:eastAsia="Consolas" w:hAnsi="Consolas"/>
+                <w:sz w:val="16"/>
+                <w:szCs w:val="16"/>
+              </w:rPr>
               <w:t xml:space="preserve">        set ssl-ssh-profile "certificate-inspection"</w:t>
+            </w:r>
+          </w:p>
+          <w:p>
+            <w:pPr>
+              <w:spacing w:after="0"/>
+            </w:pPr>
+            <w:r>
+              <w:rPr>
+                <w:rFonts w:ascii="Consolas" w:cs="Consolas" w:eastAsia="Consolas" w:hAnsi="Consolas"/>
+                <w:sz w:val="16"/>
+                <w:szCs w:val="16"/>
+              </w:rPr>
+              <w:t xml:space="preserve">        set application-list "pan-appctrl-1"</w:t>
+            </w:r>
+          </w:p>
+          <w:p>
+            <w:pPr>
+              <w:spacing w:after="0"/>
+            </w:pPr>
+            <w:r>
+              <w:rPr>
+                <w:rFonts w:ascii="Consolas" w:cs="Consolas" w:eastAsia="Consolas" w:hAnsi="Consolas"/>
+                <w:sz w:val="16"/>
+                <w:szCs w:val="16"/>
+              </w:rPr>
+              <w:t xml:space="preserve">        set ips-sensor "ips-vuln-strict-spy-strict"</w:t>
+            </w:r>
+          </w:p>
+          <w:p>
+            <w:pPr>
+              <w:spacing w:after="0"/>
+            </w:pPr>
+            <w:r>
+              <w:rPr>
+                <w:rFonts w:ascii="Consolas" w:cs="Consolas" w:eastAsia="Consolas" w:hAnsi="Consolas"/>
+                <w:sz w:val="16"/>
+                <w:szCs w:val="16"/>
+              </w:rPr>
+              <w:t xml:space="preserve">        set av-profile "av-av1-wf"            # av-scan + FortiSandbox</w:t>
             </w:r>
           </w:p>
           <w:p>
@@ -4720,10 +5432,10 @@
           <w:b/>
           <w:bCs/>
         </w:rPr>
-        <w:t xml:space="preserve">FortiGuard web categories </w:t>
-      </w:r>
-      <w:r>
-        <w:t xml:space="preserve">(the ~93 IDs used by URL-filtering) were read from the device at /api/v2/monitor/webfilter/fortiguard-categories.</w:t>
+        <w:t xml:space="preserve">The FortiGuard application-signature DB </w:t>
+      </w:r>
+      <w:r>
+        <w:t xml:space="preserve">(~3,300 signatures with their IDs) was read from the device at /api/v2/cmdb/application/name — this drives per-application App-ID.</w:t>
       </w:r>
     </w:p>
     <w:p>
@@ -4740,10 +5452,10 @@
           <w:b/>
           <w:bCs/>
         </w:rPr>
-        <w:t xml:space="preserve">File-filter file types </w:t>
-      </w:r>
-      <w:r>
-        <w:t xml:space="preserve">were read from the device's antivirus.filetype data source.</w:t>
+        <w:t xml:space="preserve">FortiGuard web categories </w:t>
+      </w:r>
+      <w:r>
+        <w:t xml:space="preserve">(the ~93 IDs used by URL-filtering) were read from /api/v2/monitor/webfilter/fortiguard-categories; file-filter file types from the antivirus.filetype data source.</w:t>
       </w:r>
     </w:p>
     <w:p>
@@ -4760,10 +5472,30 @@
           <w:b/>
           <w:bCs/>
         </w:rPr>
+        <w:t xml:space="preserve">IPS sensor filters, antivirus av-scan / fortisandbox enums, and webfilter urlfilter types </w:t>
+      </w:r>
+      <w:r>
+        <w:t xml:space="preserve">were taken from the device's CLI schema, so emitted severity / CVE / action tokens are valid for that exact build.</w:t>
+      </w:r>
+    </w:p>
+    <w:p>
+      <w:pPr>
+        <w:pStyle w:val="ListParagraph"/>
+        <w:numPr>
+          <w:ilvl w:val="0"/>
+          <w:numId w:val="2"/>
+        </w:numPr>
+        <w:spacing w:after="60"/>
+      </w:pPr>
+      <w:r>
+        <w:rPr>
+          <w:b/>
+          <w:bCs/>
+        </w:rPr>
         <w:t xml:space="preserve">The emitted configuration </w:t>
       </w:r>
       <w:r>
-        <w:t xml:space="preserve">was run through fwforge's own schema certifier against the device's CLI schema and returned 0 unknown tables and 0 unknown attributes.</w:t>
+        <w:t xml:space="preserve">(App-ID, web-filter + urlfilter, file-filter, antivirus + FortiSandbox, IPS, interfaces and policies) was run through fwforge's own schema certifier against the device's CLI schema and returned 0 unknown tables and 0 unknown attributes.</w:t>
       </w:r>
     </w:p>
     <w:p>

</xml_diff>

<commit_message>
v0.53.0: PAN multi-vsys -> valid multi-VDOM; capability doc refreshed
Version bump (0.52.2 -> 0.53.0 in __init__.py + pyproject.toml) marking the
multi-VDOM milestone landed in the prior three commits: valid multi-vsys ->
multi-VDOM scope split, management-VDOM designation, and 15-char interface-
name clamping.

Regenerated the PAN->FortiGate capability doc (docx via the generator, html
edited in place, pdf re-rendered) to v0.53.0, and updated the capability
matrix: the multi-vsys row now notes interfaces hoisted to config global
with set vdom + a management VDOM, and the interfaces row notes the 15-char
name clamp.

Co-Authored-By: Claude Opus 4.8 (1M context) <noreply@anthropic.com>
</commit_message>
<xml_diff>
--- a/fwforge_PaloAlto_to_FortiGate.docx
+++ b/fwforge_PaloAlto_to_FortiGate.docx
@@ -71,7 +71,7 @@
         <w:rPr>
           <w:color w:val="555555"/>
         </w:rPr>
-        <w:t xml:space="preserve">Prepared for Fortinet engineering review · June 2026 · fwforge v0.52.2</w:t>
+        <w:t xml:space="preserve">Prepared for Fortinet engineering review · June 2026 · fwforge v0.53.0</w:t>
       </w:r>
     </w:p>
     <w:p>
@@ -704,7 +704,7 @@
                 <w:sz w:val="18"/>
                 <w:szCs w:val="18"/>
               </w:rPr>
-              <w:t xml:space="preserve">Device-group selection; shared + pre/post rulebases merged in PAN evaluation order; optional template for network config; each vsys → its own FortiOS VDOM</w:t>
+              <w:t xml:space="preserve">Device-group selection; shared + pre/post rulebases merged in PAN evaluation order; optional template for network config; each vsys → its own FortiOS VDOM — interfaces hoisted to config global with set vdom, a management VDOM designated</w:t>
             </w:r>
           </w:p>
         </w:tc>
@@ -841,7 +841,7 @@
                 <w:sz w:val="18"/>
                 <w:szCs w:val="18"/>
               </w:rPr>
-              <w:t xml:space="preserve">Mapped to the destination model's real ports via a faceplate UI with positional auto-guess; promote-a-port-to-LAG and “do not map” supported.</w:t>
+              <w:t xml:space="preserve">Mapped to the destination model's real ports via a faceplate UI with positional auto-guess; promote-a-port-to-LAG and “do not map” supported. Created VLAN / aggregate / loopback names are clamped to FortiOS's 15-char interface-name limit, references remapped.</w:t>
             </w:r>
           </w:p>
         </w:tc>

</xml_diff>

<commit_message>
v0.54.0: device-system carry-over; capability doc refreshed
Version bump (0.53.0 -> 0.54.0 in __init__.py + pyproject.toml) cutting the
release that adds device-system carry-over (hostname/DNS/NTP across PAN /
pfSense / ASA / SRX, commit 4a68130), alongside the post-0.53.0 fixes (IPsec
zone->tunnel resolution, aggregate-port multiselect).

Regenerated the PAN->FortiGate capability doc (docx via the generator, html
edited in place, pdf re-rendered) to v0.54.0 and added a "Device system" row
to the capability matrix (hostname/DNS/NTP -> config system global/dns/ntp).

Co-Authored-By: Claude Opus 4.8 (1M context) <noreply@anthropic.com>
</commit_message>
<xml_diff>
--- a/fwforge_PaloAlto_to_FortiGate.docx
+++ b/fwforge_PaloAlto_to_FortiGate.docx
@@ -71,7 +71,7 @@
         <w:rPr>
           <w:color w:val="555555"/>
         </w:rPr>
-        <w:t xml:space="preserve">Prepared for Fortinet engineering review · June 2026 · fwforge v0.53.0</w:t>
+        <w:t xml:space="preserve">Prepared for Fortinet engineering review · June 2026 · fwforge v0.54.0</w:t>
       </w:r>
     </w:p>
     <w:p>
@@ -634,6 +634,110 @@
                 <w:szCs w:val="18"/>
               </w:rPr>
               <w:t xml:space="preserve">One unified parser, auto-detected. Panorama template-merged running-configs handled.</w:t>
+            </w:r>
+          </w:p>
+        </w:tc>
+      </w:tr>
+      <w:tr>
+        <w:trPr>
+          <w:tblHeader w:val="false"/>
+        </w:trPr>
+        <w:tc>
+          <w:tcPr>
+            <w:tcW w:type="dxa" w:w="1700"/>
+            <w:tcBorders>
+              <w:top w:val="single" w:color="B7B7B7" w:sz="1"/>
+              <w:left w:val="single" w:color="B7B7B7" w:sz="1"/>
+              <w:bottom w:val="single" w:color="B7B7B7" w:sz="1"/>
+              <w:right w:val="single" w:color="B7B7B7" w:sz="1"/>
+            </w:tcBorders>
+            <w:shd w:fill="FFFFFF" w:val="clear"/>
+            <w:tcMar>
+              <w:top w:type="dxa" w:w="60"/>
+              <w:left w:type="dxa" w:w="110"/>
+              <w:bottom w:type="dxa" w:w="60"/>
+              <w:right w:type="dxa" w:w="110"/>
+            </w:tcMar>
+          </w:tcPr>
+          <w:p>
+            <w:pPr>
+              <w:spacing w:after="0"/>
+            </w:pPr>
+            <w:r>
+              <w:rPr>
+                <w:b/>
+                <w:bCs/>
+                <w:color w:val="1A1A1A"/>
+                <w:sz w:val="18"/>
+                <w:szCs w:val="18"/>
+              </w:rPr>
+              <w:t xml:space="preserve">Device system</w:t>
+            </w:r>
+          </w:p>
+        </w:tc>
+        <w:tc>
+          <w:tcPr>
+            <w:tcW w:type="dxa" w:w="4060"/>
+            <w:tcBorders>
+              <w:top w:val="single" w:color="B7B7B7" w:sz="1"/>
+              <w:left w:val="single" w:color="B7B7B7" w:sz="1"/>
+              <w:bottom w:val="single" w:color="B7B7B7" w:sz="1"/>
+              <w:right w:val="single" w:color="B7B7B7" w:sz="1"/>
+            </w:tcBorders>
+            <w:shd w:fill="FFFFFF" w:val="clear"/>
+            <w:tcMar>
+              <w:top w:type="dxa" w:w="60"/>
+              <w:left w:type="dxa" w:w="110"/>
+              <w:bottom w:type="dxa" w:w="60"/>
+              <w:right w:type="dxa" w:w="110"/>
+            </w:tcMar>
+          </w:tcPr>
+          <w:p>
+            <w:pPr>
+              <w:spacing w:after="0"/>
+            </w:pPr>
+            <w:r>
+              <w:rPr>
+                <w:b w:val="false"/>
+                <w:bCs w:val="false"/>
+                <w:color w:val="1A1A1A"/>
+                <w:sz w:val="18"/>
+                <w:szCs w:val="18"/>
+              </w:rPr>
+              <w:t xml:space="preserve">deviceconfig hostname, DNS (dns-setting), and NTP (ntp-servers) → config system global / dns / ntp</w:t>
+            </w:r>
+          </w:p>
+        </w:tc>
+        <w:tc>
+          <w:tcPr>
+            <w:tcW w:type="dxa" w:w="3600"/>
+            <w:tcBorders>
+              <w:top w:val="single" w:color="B7B7B7" w:sz="1"/>
+              <w:left w:val="single" w:color="B7B7B7" w:sz="1"/>
+              <w:bottom w:val="single" w:color="B7B7B7" w:sz="1"/>
+              <w:right w:val="single" w:color="B7B7B7" w:sz="1"/>
+            </w:tcBorders>
+            <w:shd w:fill="FFFFFF" w:val="clear"/>
+            <w:tcMar>
+              <w:top w:type="dxa" w:w="60"/>
+              <w:left w:type="dxa" w:w="110"/>
+              <w:bottom w:type="dxa" w:w="60"/>
+              <w:right w:type="dxa" w:w="110"/>
+            </w:tcMar>
+          </w:tcPr>
+          <w:p>
+            <w:pPr>
+              <w:spacing w:after="0"/>
+            </w:pPr>
+            <w:r>
+              <w:rPr>
+                <w:b w:val="false"/>
+                <w:bCs w:val="false"/>
+                <w:color w:val="1A1A1A"/>
+                <w:sz w:val="18"/>
+                <w:szCs w:val="18"/>
+              </w:rPr>
+              <w:t xml:space="preserve">Emitted ahead of the security config; classifies into config global under a VDOM wrap, once per device for multi-vsys.</w:t>
             </w:r>
           </w:p>
         </w:tc>

</xml_diff>